<commit_message>
Ajustes finales en cuanto a curso y diplomado
</commit_message>
<xml_diff>
--- a/Accesos zoquital.docx
+++ b/Accesos zoquital.docx
@@ -40,13 +40,7 @@
         <w:rPr>
           <w:lang w:val="en-US"/>
         </w:rPr>
-        <w:t>/home/unoswkjs/zoquital.com</w:t>
-      </w:r>
-      <w:r>
-        <w:rPr>
-          <w:lang w:val="en-US"/>
-        </w:rPr>
-        <w:t xml:space="preserve"> </w:t>
+        <w:t xml:space="preserve">/home/unoswkjs/zoquital.com </w:t>
       </w:r>
     </w:p>
     <w:p>
@@ -115,21 +109,136 @@
         <w:rPr>
           <w:lang w:val="en-US"/>
         </w:rPr>
-        <w:t>FTP &amp; explicit FTPS port:  21</w:t>
-      </w:r>
-      <w:r>
-        <w:rPr>
-          <w:lang w:val="en-US"/>
-        </w:rPr>
+        <w:t xml:space="preserve">FTP &amp; explicit FTPS port:  21 </w:t>
+      </w:r>
+    </w:p>
+    <w:p>
+      <w:pPr>
+        <w:rPr>
+          <w:lang w:val="en-US"/>
+        </w:rPr>
+      </w:pPr>
+    </w:p>
+    <w:p>
+      <w:r>
+        <w:t xml:space="preserve">Accesos </w:t>
+      </w:r>
+      <w:proofErr w:type="spellStart"/>
+      <w:r>
+        <w:t>zoquital</w:t>
+      </w:r>
+      <w:proofErr w:type="spellEnd"/>
+    </w:p>
+    <w:p>
+      <w:hyperlink r:id="rId7" w:history="1">
+        <w:r>
+          <w:rPr>
+            <w:rStyle w:val="Hipervnculo"/>
+          </w:rPr>
+          <w:t>admin@zoquital.com</w:t>
+        </w:r>
+      </w:hyperlink>
+      <w:r>
         <w:t xml:space="preserve"> </w:t>
       </w:r>
     </w:p>
     <w:p>
+      <w:r>
+        <w:t>mq</w:t>
+      </w:r>
+      <w:proofErr w:type="gramStart"/>
+      <w:r>
+        <w:t>9</w:t>
+      </w:r>
+      <w:r>
+        <w:t>..</w:t>
+      </w:r>
+      <w:proofErr w:type="gramEnd"/>
+      <w:r>
+        <w:t>TYj</w:t>
+      </w:r>
+    </w:p>
+    <w:p>
       <w:pPr>
         <w:rPr>
           <w:lang w:val="en-US"/>
         </w:rPr>
       </w:pPr>
+      <w:r>
+        <w:rPr>
+          <w:lang w:val="en-US"/>
+        </w:rPr>
+        <w:t xml:space="preserve">/home/unoswkjs/zoquital.com </w:t>
+      </w:r>
+    </w:p>
+    <w:p>
+      <w:pPr>
+        <w:rPr>
+          <w:lang w:val="en-US"/>
+        </w:rPr>
+      </w:pPr>
+      <w:r>
+        <w:rPr>
+          <w:lang w:val="en-US"/>
+        </w:rPr>
+        <w:t xml:space="preserve">FTP Username: </w:t>
+      </w:r>
+      <w:hyperlink r:id="rId8" w:history="1">
+        <w:r>
+          <w:rPr>
+            <w:rStyle w:val="Hipervnculo"/>
+            <w:lang w:val="en-US"/>
+          </w:rPr>
+          <w:t>admin@zoquital.com</w:t>
+        </w:r>
+      </w:hyperlink>
+      <w:r>
+        <w:rPr>
+          <w:lang w:val="en-US"/>
+        </w:rPr>
+        <w:t xml:space="preserve"> </w:t>
+      </w:r>
+    </w:p>
+    <w:p>
+      <w:pPr>
+        <w:rPr>
+          <w:lang w:val="en-US"/>
+        </w:rPr>
+      </w:pPr>
+      <w:r>
+        <w:rPr>
+          <w:lang w:val="en-US"/>
+        </w:rPr>
+        <w:t xml:space="preserve">FTP server: </w:t>
+      </w:r>
+      <w:hyperlink r:id="rId9" w:history="1">
+        <w:r>
+          <w:rPr>
+            <w:rStyle w:val="Hipervnculo"/>
+            <w:lang w:val="en-US"/>
+          </w:rPr>
+          <w:t>ftp.servicioengo.com</w:t>
+        </w:r>
+      </w:hyperlink>
+      <w:r>
+        <w:rPr>
+          <w:lang w:val="en-US"/>
+        </w:rPr>
+        <w:t xml:space="preserve"> </w:t>
+      </w:r>
+    </w:p>
+    <w:p>
+      <w:pPr>
+        <w:rPr>
+          <w:lang w:val="en-US"/>
+        </w:rPr>
+      </w:pPr>
+      <w:r>
+        <w:rPr>
+          <w:lang w:val="en-US"/>
+        </w:rPr>
+        <w:t xml:space="preserve">FTP &amp; explicit FTPS port:  21 </w:t>
+      </w:r>
     </w:p>
     <w:p>
       <w:pPr>

</xml_diff>